<commit_message>
Updates to JD's article
</commit_message>
<xml_diff>
--- a/assets/Counting Megawatts, Missing People.docx
+++ b/assets/Counting Megawatts, Missing People.docx
@@ -24,60 +24,10 @@
       <w:r>
         <w:rPr>
           <w:rFonts w:eastAsia="Times New Roman"/>
-          <w:b/>
-          <w:bCs/>
-          <w:sz w:val="24"/>
-          <w:szCs w:val="24"/>
-        </w:rPr>
-        <w:t>Counting Megawatts, Missing People:</w:t>
-      </w:r>
-      <w:r>
-        <w:rPr>
-          <w:rFonts w:eastAsia="Times New Roman"/>
-          <w:b/>
-          <w:bCs/>
-          <w:sz w:val="24"/>
-          <w:szCs w:val="24"/>
-        </w:rPr>
-        <w:br/>
-        <w:t xml:space="preserve"> The Social Gap in Climate Finance</w:t>
-      </w:r>
-    </w:p>
-    <w:p>
-      <w:pPr>
-        <w:spacing w:after="280" w:line="240" w:lineRule="auto"/>
-        <w:jc w:val="both"/>
-        <w:rPr>
-          <w:rFonts w:eastAsia="Times New Roman"/>
-          <w:sz w:val="24"/>
-          <w:szCs w:val="24"/>
-        </w:rPr>
-      </w:pPr>
-      <w:r>
-        <w:rPr>
-          <w:rFonts w:eastAsia="Times New Roman"/>
-          <w:sz w:val="24"/>
-          <w:szCs w:val="24"/>
-        </w:rPr>
-        <w:t xml:space="preserve">Global climate finance is rising impressively but not fast or </w:t>
-      </w:r>
-      <w:proofErr w:type="gramStart"/>
-      <w:r>
-        <w:rPr>
-          <w:rFonts w:eastAsia="Times New Roman"/>
-          <w:sz w:val="24"/>
-          <w:szCs w:val="24"/>
-        </w:rPr>
-        <w:t>fairly enough</w:t>
-      </w:r>
-      <w:proofErr w:type="gramEnd"/>
-      <w:r>
-        <w:rPr>
-          <w:rFonts w:eastAsia="Times New Roman"/>
-          <w:sz w:val="24"/>
-          <w:szCs w:val="24"/>
-        </w:rPr>
-        <w:t xml:space="preserve">. The world is getting better at counting megawatts, gigatons, and their respective financial flows, but still struggles to measure a critical component to decouple economic growth from emissions: the social implications of transitions. This “silent” line item in the climate ledger is the cost of helping communities and workers navigate </w:t>
+          <w:sz w:val="24"/>
+          <w:szCs w:val="24"/>
+        </w:rPr>
+        <w:t xml:space="preserve">Global climate finance is rising impressively but not fast or fairly enough. The world is getting better at counting megawatts, gigatons, and their respective financial flows, but still struggles to measure a critical component to decouple economic growth from emissions: the social implications of transitions. This “silent” line item in the climate ledger is the cost of helping communities and workers navigate </w:t>
       </w:r>
       <w:proofErr w:type="spellStart"/>
       <w:r>
@@ -436,16 +386,7 @@
           <w:sz w:val="24"/>
           <w:szCs w:val="24"/>
         </w:rPr>
-        <w:t xml:space="preserve">Overlaying these two shortfalls—mitigation and adaptation—is a third imbalance: the just transition. It covers income bridges, reskilling, and regional redevelopment. Unlike turbines or </w:t>
-      </w:r>
-      <w:r>
-        <w:rPr>
-          <w:rFonts w:eastAsia="Times New Roman"/>
-          <w:sz w:val="24"/>
-          <w:szCs w:val="24"/>
-        </w:rPr>
-        <w:lastRenderedPageBreak/>
-        <w:t xml:space="preserve">seawalls, these costs rarely appear in financial trackers, yet they determine whether </w:t>
+        <w:t xml:space="preserve">Overlaying these two shortfalls—mitigation and adaptation—is a third imbalance: the just transition. It covers income bridges, reskilling, and regional redevelopment. Unlike turbines or seawalls, these costs rarely appear in financial trackers, yet they determine whether </w:t>
       </w:r>
       <w:proofErr w:type="spellStart"/>
       <w:r>
@@ -482,6 +423,7 @@
           <w:sz w:val="24"/>
           <w:szCs w:val="24"/>
         </w:rPr>
+        <w:lastRenderedPageBreak/>
         <w:t xml:space="preserve">Some regions have started to acknowledge this issue. The European Union’s Just Transition Mechanism is a clear example. Between 2021 and 2027 it aims to </w:t>
       </w:r>
       <w:proofErr w:type="spellStart"/>
@@ -838,7 +780,25 @@
           <w:sz w:val="24"/>
           <w:szCs w:val="24"/>
         </w:rPr>
-        <w:t>Extending this logic to a global estimate fails for reasons that do not affect mitigation or adaptation accounting to the same degree. Mitigation needs to follow engineering and power-</w:t>
+        <w:t xml:space="preserve">Extending this logic to a global estimate fails for reasons that do not affect mitigation or adaptation accounting to the same degree. Mitigation needs to follow engineering and power-system math. Adaptation needs to follow hazard, exposure, and asset-level cost curves. Just transition needs depend on social baselines, labor law, informality, </w:t>
+      </w:r>
+      <w:proofErr w:type="spellStart"/>
+      <w:r>
+        <w:rPr>
+          <w:rFonts w:eastAsia="Times New Roman"/>
+          <w:sz w:val="24"/>
+          <w:szCs w:val="24"/>
+        </w:rPr>
+        <w:t>unionisation</w:t>
+      </w:r>
+      <w:proofErr w:type="spellEnd"/>
+      <w:r>
+        <w:rPr>
+          <w:rFonts w:eastAsia="Times New Roman"/>
+          <w:sz w:val="24"/>
+          <w:szCs w:val="24"/>
+        </w:rPr>
+        <w:t xml:space="preserve">, migration frictions, and existing public services. Spain’s regions have unemployment insurance, active </w:t>
       </w:r>
       <w:r>
         <w:rPr>
@@ -847,25 +807,7 @@
           <w:szCs w:val="24"/>
         </w:rPr>
         <w:lastRenderedPageBreak/>
-        <w:t xml:space="preserve">system math. Adaptation needs to follow hazard, exposure, and asset-level cost curves. Just transition needs depend on social baselines, labor law, informality, </w:t>
-      </w:r>
-      <w:proofErr w:type="spellStart"/>
-      <w:r>
-        <w:rPr>
-          <w:rFonts w:eastAsia="Times New Roman"/>
-          <w:sz w:val="24"/>
-          <w:szCs w:val="24"/>
-        </w:rPr>
-        <w:t>unionisation</w:t>
-      </w:r>
-      <w:proofErr w:type="spellEnd"/>
-      <w:r>
-        <w:rPr>
-          <w:rFonts w:eastAsia="Times New Roman"/>
-          <w:sz w:val="24"/>
-          <w:szCs w:val="24"/>
-        </w:rPr>
-        <w:t>, migration frictions, and existing public services. Spain’s regions have unemployment insurance, active labor-market programs, and municipal capacity. Employers in parts of Australia co-finance benefits and retraining, so the public bill is smaller. In India many affected workers lack formal contracts and contributory benefits, so effective support requires broader cash programs, public works, and community services, often at lower per-capita cost but much higher coverage. Add wide differences in prices and wages, the mix of grants and loans, weak tagging of social line items inside energy tenders, and long lags between commitments and disbursements. The result is a moving target that cannot be read from a single experience.</w:t>
+        <w:t>labor-market programs, and municipal capacity. Employers in parts of Australia co-finance benefits and retraining, so the public bill is smaller. In India many affected workers lack formal contracts and contributory benefits, so effective support requires broader cash programs, public works, and community services, often at lower per-capita cost but much higher coverage. Add wide differences in prices and wages, the mix of grants and loans, weak tagging of social line items inside energy tenders, and long lags between commitments and disbursements. The result is a moving target that cannot be read from a single experience.</w:t>
       </w:r>
     </w:p>
     <w:p>
@@ -1185,7 +1127,6 @@
           <w:sz w:val="24"/>
           <w:szCs w:val="24"/>
         </w:rPr>
-        <w:lastRenderedPageBreak/>
         <w:t>decarbonisation</w:t>
       </w:r>
       <w:proofErr w:type="spellEnd"/>
@@ -1214,6 +1155,7 @@
           <w:sz w:val="24"/>
           <w:szCs w:val="24"/>
         </w:rPr>
+        <w:lastRenderedPageBreak/>
         <w:t xml:space="preserve">If the world intends to accelerate mitigation and adaptation, it must confront a central fact: in many regions fossil fuels still provide basic livelihoods. Despite their environmental damage, links to corruption, </w:t>
       </w:r>
       <w:proofErr w:type="spellStart"/>

</xml_diff>